<commit_message>
updated group leader in proposal
</commit_message>
<xml_diff>
--- a/DBMS-Proposal.docx
+++ b/DBMS-Proposal.docx
@@ -709,6 +709,14 @@
                     </w:rPr>
                     <w:t>Muhammad Farhan</w:t>
                   </w:r>
+                  <w:r>
+                    <w:rPr>
+                      <w:rFonts w:ascii="Times New Roman" w:hAnsi="Times New Roman" w:cs="Times New Roman"/>
+                      <w:sz w:val="24"/>
+                      <w:szCs w:val="24"/>
+                    </w:rPr>
+                    <w:t xml:space="preserve"> (Group Lead)</w:t>
+                  </w:r>
                 </w:p>
               </w:tc>
               <w:tc>
@@ -1002,7 +1010,6 @@
                 <w:rFonts w:ascii="Times New Roman" w:hAnsi="Times New Roman" w:cs="Times New Roman"/>
                 <w:sz w:val="24"/>
                 <w:szCs w:val="24"/>
-                <w:lang/>
               </w:rPr>
             </w:pPr>
             <w:r>
@@ -1012,7 +1019,6 @@
                 <w:bCs/>
                 <w:sz w:val="24"/>
                 <w:szCs w:val="24"/>
-                <w:lang/>
               </w:rPr>
               <w:t>StudySphere</w:t>
             </w:r>
@@ -1021,7 +1027,6 @@
                 <w:rFonts w:ascii="Times New Roman" w:hAnsi="Times New Roman" w:cs="Times New Roman"/>
                 <w:sz w:val="24"/>
                 <w:szCs w:val="24"/>
-                <w:lang/>
               </w:rPr>
               <w:t xml:space="preserve"> </w:t>
             </w:r>
@@ -1030,7 +1035,6 @@
                 <w:rFonts w:ascii="Times New Roman" w:hAnsi="Times New Roman" w:cs="Times New Roman"/>
                 <w:sz w:val="24"/>
                 <w:szCs w:val="24"/>
-                <w:lang/>
               </w:rPr>
               <w:t xml:space="preserve">is a web-based </w:t>
             </w:r>
@@ -1039,7 +1043,6 @@
                 <w:rFonts w:ascii="Times New Roman" w:hAnsi="Times New Roman" w:cs="Times New Roman"/>
                 <w:sz w:val="24"/>
                 <w:szCs w:val="24"/>
-                <w:lang/>
               </w:rPr>
               <w:t xml:space="preserve">database </w:t>
             </w:r>
@@ -1048,7 +1051,6 @@
                 <w:rFonts w:ascii="Times New Roman" w:hAnsi="Times New Roman" w:cs="Times New Roman"/>
                 <w:sz w:val="24"/>
                 <w:szCs w:val="24"/>
-                <w:lang/>
               </w:rPr>
               <w:t xml:space="preserve">management system </w:t>
             </w:r>
@@ -1057,7 +1059,6 @@
                 <w:rFonts w:ascii="Times New Roman" w:hAnsi="Times New Roman" w:cs="Times New Roman"/>
                 <w:sz w:val="24"/>
                 <w:szCs w:val="24"/>
-                <w:lang/>
               </w:rPr>
               <w:t>that</w:t>
             </w:r>
@@ -1066,7 +1067,6 @@
                 <w:rFonts w:ascii="Times New Roman" w:hAnsi="Times New Roman" w:cs="Times New Roman"/>
                 <w:sz w:val="24"/>
                 <w:szCs w:val="24"/>
-                <w:lang/>
               </w:rPr>
               <w:t xml:space="preserve"> is scoped to serve two user roles </w:t>
             </w:r>
@@ -1077,7 +1077,6 @@
                 <w:bCs/>
                 <w:sz w:val="24"/>
                 <w:szCs w:val="24"/>
-                <w:lang/>
               </w:rPr>
               <w:t>Students</w:t>
             </w:r>
@@ -1086,7 +1085,6 @@
                 <w:rFonts w:ascii="Times New Roman" w:hAnsi="Times New Roman" w:cs="Times New Roman"/>
                 <w:sz w:val="24"/>
                 <w:szCs w:val="24"/>
-                <w:lang/>
               </w:rPr>
               <w:t xml:space="preserve"> and </w:t>
             </w:r>
@@ -1097,7 +1095,6 @@
                 <w:bCs/>
                 <w:sz w:val="24"/>
                 <w:szCs w:val="24"/>
-                <w:lang/>
               </w:rPr>
               <w:t>Admins</w:t>
             </w:r>
@@ -1106,7 +1103,6 @@
                 <w:rFonts w:ascii="Times New Roman" w:hAnsi="Times New Roman" w:cs="Times New Roman"/>
                 <w:sz w:val="24"/>
                 <w:szCs w:val="24"/>
-                <w:lang/>
               </w:rPr>
               <w:t xml:space="preserve"> within an education domain.</w:t>
             </w:r>
@@ -1118,15 +1114,13 @@
                 <w:rFonts w:ascii="Times New Roman" w:hAnsi="Times New Roman" w:cs="Times New Roman"/>
                 <w:sz w:val="24"/>
                 <w:szCs w:val="24"/>
-                <w:lang/>
-              </w:rPr>
-            </w:pPr>
-            <w:r>
-              <w:rPr>
-                <w:rFonts w:ascii="Times New Roman" w:hAnsi="Times New Roman" w:cs="Times New Roman"/>
-                <w:sz w:val="24"/>
-                <w:szCs w:val="24"/>
-                <w:lang/>
+              </w:rPr>
+            </w:pPr>
+            <w:r>
+              <w:rPr>
+                <w:rFonts w:ascii="Times New Roman" w:hAnsi="Times New Roman" w:cs="Times New Roman"/>
+                <w:sz w:val="24"/>
+                <w:szCs w:val="24"/>
               </w:rPr>
               <w:t>The scope covers:</w:t>
             </w:r>
@@ -1142,15 +1136,13 @@
                 <w:rFonts w:ascii="Times New Roman" w:hAnsi="Times New Roman" w:cs="Times New Roman"/>
                 <w:sz w:val="24"/>
                 <w:szCs w:val="24"/>
-                <w:lang/>
-              </w:rPr>
-            </w:pPr>
-            <w:r>
-              <w:rPr>
-                <w:rFonts w:ascii="Times New Roman" w:hAnsi="Times New Roman" w:cs="Times New Roman"/>
-                <w:sz w:val="24"/>
-                <w:szCs w:val="24"/>
-                <w:lang/>
+              </w:rPr>
+            </w:pPr>
+            <w:r>
+              <w:rPr>
+                <w:rFonts w:ascii="Times New Roman" w:hAnsi="Times New Roman" w:cs="Times New Roman"/>
+                <w:sz w:val="24"/>
+                <w:szCs w:val="24"/>
               </w:rPr>
               <w:t>Student registration, login, and secure authentication (BCrypt password hashing + forgot-password token flow)</w:t>
             </w:r>
@@ -1166,15 +1158,13 @@
                 <w:rFonts w:ascii="Times New Roman" w:hAnsi="Times New Roman" w:cs="Times New Roman"/>
                 <w:sz w:val="24"/>
                 <w:szCs w:val="24"/>
-                <w:lang/>
-              </w:rPr>
-            </w:pPr>
-            <w:r>
-              <w:rPr>
-                <w:rFonts w:ascii="Times New Roman" w:hAnsi="Times New Roman" w:cs="Times New Roman"/>
-                <w:sz w:val="24"/>
-                <w:szCs w:val="24"/>
-                <w:lang/>
+              </w:rPr>
+            </w:pPr>
+            <w:r>
+              <w:rPr>
+                <w:rFonts w:ascii="Times New Roman" w:hAnsi="Times New Roman" w:cs="Times New Roman"/>
+                <w:sz w:val="24"/>
+                <w:szCs w:val="24"/>
               </w:rPr>
               <w:t>Study session logging per subject with hours and productivity tracking</w:t>
             </w:r>
@@ -1190,15 +1180,13 @@
                 <w:rFonts w:ascii="Times New Roman" w:hAnsi="Times New Roman" w:cs="Times New Roman"/>
                 <w:sz w:val="24"/>
                 <w:szCs w:val="24"/>
-                <w:lang/>
-              </w:rPr>
-            </w:pPr>
-            <w:r>
-              <w:rPr>
-                <w:rFonts w:ascii="Times New Roman" w:hAnsi="Times New Roman" w:cs="Times New Roman"/>
-                <w:sz w:val="24"/>
-                <w:szCs w:val="24"/>
-                <w:lang/>
+              </w:rPr>
+            </w:pPr>
+            <w:r>
+              <w:rPr>
+                <w:rFonts w:ascii="Times New Roman" w:hAnsi="Times New Roman" w:cs="Times New Roman"/>
+                <w:sz w:val="24"/>
+                <w:szCs w:val="24"/>
               </w:rPr>
               <w:t>Goal setting with deadlines and completion status</w:t>
             </w:r>
@@ -1214,15 +1202,13 @@
                 <w:rFonts w:ascii="Times New Roman" w:hAnsi="Times New Roman" w:cs="Times New Roman"/>
                 <w:sz w:val="24"/>
                 <w:szCs w:val="24"/>
-                <w:lang/>
-              </w:rPr>
-            </w:pPr>
-            <w:r>
-              <w:rPr>
-                <w:rFonts w:ascii="Times New Roman" w:hAnsi="Times New Roman" w:cs="Times New Roman"/>
-                <w:sz w:val="24"/>
-                <w:szCs w:val="24"/>
-                <w:lang/>
+              </w:rPr>
+            </w:pPr>
+            <w:r>
+              <w:rPr>
+                <w:rFonts w:ascii="Times New Roman" w:hAnsi="Times New Roman" w:cs="Times New Roman"/>
+                <w:sz w:val="24"/>
+                <w:szCs w:val="24"/>
               </w:rPr>
               <w:t>Automated weak-area detection triggered by low productivity scores</w:t>
             </w:r>
@@ -1238,15 +1224,13 @@
                 <w:rFonts w:ascii="Times New Roman" w:hAnsi="Times New Roman" w:cs="Times New Roman"/>
                 <w:sz w:val="24"/>
                 <w:szCs w:val="24"/>
-                <w:lang/>
-              </w:rPr>
-            </w:pPr>
-            <w:r>
-              <w:rPr>
-                <w:rFonts w:ascii="Times New Roman" w:hAnsi="Times New Roman" w:cs="Times New Roman"/>
-                <w:sz w:val="24"/>
-                <w:szCs w:val="24"/>
-                <w:lang/>
+              </w:rPr>
+            </w:pPr>
+            <w:r>
+              <w:rPr>
+                <w:rFonts w:ascii="Times New Roman" w:hAnsi="Times New Roman" w:cs="Times New Roman"/>
+                <w:sz w:val="24"/>
+                <w:szCs w:val="24"/>
               </w:rPr>
               <w:t>Admin management of subjects and study recommendations</w:t>
             </w:r>
@@ -1262,15 +1246,13 @@
                 <w:rFonts w:ascii="Times New Roman" w:hAnsi="Times New Roman" w:cs="Times New Roman"/>
                 <w:sz w:val="24"/>
                 <w:szCs w:val="24"/>
-                <w:lang/>
-              </w:rPr>
-            </w:pPr>
-            <w:r>
-              <w:rPr>
-                <w:rFonts w:ascii="Times New Roman" w:hAnsi="Times New Roman" w:cs="Times New Roman"/>
-                <w:sz w:val="24"/>
-                <w:szCs w:val="24"/>
-                <w:lang/>
+              </w:rPr>
+            </w:pPr>
+            <w:r>
+              <w:rPr>
+                <w:rFonts w:ascii="Times New Roman" w:hAnsi="Times New Roman" w:cs="Times New Roman"/>
+                <w:sz w:val="24"/>
+                <w:szCs w:val="24"/>
               </w:rPr>
               <w:t>Analytics dashboard generating daily/weekly reports per student</w:t>
             </w:r>
@@ -1286,15 +1268,13 @@
                 <w:rFonts w:ascii="Times New Roman" w:hAnsi="Times New Roman" w:cs="Times New Roman"/>
                 <w:sz w:val="24"/>
                 <w:szCs w:val="24"/>
-                <w:lang/>
-              </w:rPr>
-            </w:pPr>
-            <w:r>
-              <w:rPr>
-                <w:rFonts w:ascii="Times New Roman" w:hAnsi="Times New Roman" w:cs="Times New Roman"/>
-                <w:sz w:val="24"/>
-                <w:szCs w:val="24"/>
-                <w:lang/>
+              </w:rPr>
+            </w:pPr>
+            <w:r>
+              <w:rPr>
+                <w:rFonts w:ascii="Times New Roman" w:hAnsi="Times New Roman" w:cs="Times New Roman"/>
+                <w:sz w:val="24"/>
+                <w:szCs w:val="24"/>
               </w:rPr>
               <w:t>A 10-table relational database covering all 13 DBMS lab topics (DDL, DML, SELECT, JOINs, Aggregates, Set Operations, Subqueries, Indexes, Views, Stored Procedures, Triggers, ROLLUP, and DB Connectivity)</w:t>
             </w:r>
@@ -1310,15 +1290,13 @@
                 <w:rFonts w:ascii="Times New Roman" w:hAnsi="Times New Roman" w:cs="Times New Roman"/>
                 <w:sz w:val="24"/>
                 <w:szCs w:val="24"/>
-                <w:lang/>
-              </w:rPr>
-            </w:pPr>
-            <w:r>
-              <w:rPr>
-                <w:rFonts w:ascii="Times New Roman" w:hAnsi="Times New Roman" w:cs="Times New Roman"/>
-                <w:sz w:val="24"/>
-                <w:szCs w:val="24"/>
-                <w:lang/>
+              </w:rPr>
+            </w:pPr>
+            <w:r>
+              <w:rPr>
+                <w:rFonts w:ascii="Times New Roman" w:hAnsi="Times New Roman" w:cs="Times New Roman"/>
+                <w:sz w:val="24"/>
+                <w:szCs w:val="24"/>
               </w:rPr>
               <w:t>Full-stack implementation using ASP.NET (C#) connected to SQL Server</w:t>
             </w:r>
@@ -1337,7 +1315,6 @@
                 <w:rFonts w:ascii="Times New Roman" w:hAnsi="Times New Roman" w:cs="Times New Roman"/>
                 <w:sz w:val="24"/>
                 <w:szCs w:val="24"/>
-                <w:lang/>
               </w:rPr>
               <w:t>Out of scope: OAuth/JWT authentication, mobile application, real-time collaboration, and external LMS integration.</w:t>
             </w:r>
@@ -1402,7 +1379,6 @@
                 <w:iCs/>
                 <w:sz w:val="24"/>
                 <w:szCs w:val="24"/>
-                <w:lang/>
               </w:rPr>
             </w:pPr>
             <w:r>
@@ -1412,7 +1388,6 @@
                 <w:iCs/>
                 <w:sz w:val="24"/>
                 <w:szCs w:val="24"/>
-                <w:lang/>
               </w:rPr>
               <w:t>StudySphere</w:t>
             </w:r>
@@ -1423,7 +1398,6 @@
                 <w:iCs/>
                 <w:sz w:val="24"/>
                 <w:szCs w:val="24"/>
-                <w:lang/>
               </w:rPr>
               <w:t xml:space="preserve"> </w:t>
             </w:r>
@@ -1434,7 +1408,6 @@
                 <w:iCs/>
                 <w:sz w:val="24"/>
                 <w:szCs w:val="24"/>
-                <w:lang/>
               </w:rPr>
               <w:t>is a data-driven web application designed to help students manage their study schedules, track subject-wise performance, and receive personalized recommendations based on their academic weak areas. The system maintains a normalized relational database of 10 tables capturing students, study sessions, goals, weak areas, notifications, and admin-managed recommendations.</w:t>
             </w:r>
@@ -1448,7 +1421,6 @@
                 <w:iCs/>
                 <w:sz w:val="24"/>
                 <w:szCs w:val="24"/>
-                <w:lang/>
               </w:rPr>
             </w:pPr>
             <w:r>
@@ -1458,7 +1430,6 @@
                 <w:iCs/>
                 <w:sz w:val="24"/>
                 <w:szCs w:val="24"/>
-                <w:lang/>
               </w:rPr>
               <w:t>At its core, the project is a comprehensive DBMS implementation: it applies all fundamental database concepts including table design with primary/foreign keys and constraints, complex multi-table joins, aggregate functions, set operations, subqueries, indexed columns for query optimization, a pre-joined view (vw_WeeklyReport), stored procedures for reusable logic, and an AFTER INSERT trigger for automatic weak-area flagging. A ROLLUP-based analytics query powers the performance dashboard. Database connectivity is handled through an ASP.NET C# web application that performs full CRUD operations against SQL Server. Security is enforced at the database level through hashed password storage and a token-based password reset mechanism with expiry validation.</w:t>
             </w:r>
@@ -1472,7 +1443,6 @@
                 <w:iCs/>
                 <w:sz w:val="24"/>
                 <w:szCs w:val="24"/>
-                <w:lang/>
               </w:rPr>
             </w:pPr>
           </w:p>
@@ -1536,7 +1506,6 @@
                 <w:rFonts w:ascii="Times New Roman" w:hAnsi="Times New Roman" w:cs="Times New Roman"/>
                 <w:sz w:val="24"/>
                 <w:szCs w:val="24"/>
-                <w:lang/>
               </w:rPr>
             </w:pPr>
             <w:r>
@@ -1546,7 +1515,6 @@
                 <w:bCs/>
                 <w:sz w:val="24"/>
                 <w:szCs w:val="24"/>
-                <w:lang/>
               </w:rPr>
               <w:t>Student-Facing:</w:t>
             </w:r>
@@ -1562,15 +1530,13 @@
                 <w:rFonts w:ascii="Times New Roman" w:hAnsi="Times New Roman" w:cs="Times New Roman"/>
                 <w:sz w:val="24"/>
                 <w:szCs w:val="24"/>
-                <w:lang/>
-              </w:rPr>
-            </w:pPr>
-            <w:r>
-              <w:rPr>
-                <w:rFonts w:ascii="Times New Roman" w:hAnsi="Times New Roman" w:cs="Times New Roman"/>
-                <w:sz w:val="24"/>
-                <w:szCs w:val="24"/>
-                <w:lang/>
+              </w:rPr>
+            </w:pPr>
+            <w:r>
+              <w:rPr>
+                <w:rFonts w:ascii="Times New Roman" w:hAnsi="Times New Roman" w:cs="Times New Roman"/>
+                <w:sz w:val="24"/>
+                <w:szCs w:val="24"/>
               </w:rPr>
               <w:t>Register and log in with BCrypt-secured credentials</w:t>
             </w:r>
@@ -1586,15 +1552,13 @@
                 <w:rFonts w:ascii="Times New Roman" w:hAnsi="Times New Roman" w:cs="Times New Roman"/>
                 <w:sz w:val="24"/>
                 <w:szCs w:val="24"/>
-                <w:lang/>
-              </w:rPr>
-            </w:pPr>
-            <w:r>
-              <w:rPr>
-                <w:rFonts w:ascii="Times New Roman" w:hAnsi="Times New Roman" w:cs="Times New Roman"/>
-                <w:sz w:val="24"/>
-                <w:szCs w:val="24"/>
-                <w:lang/>
+              </w:rPr>
+            </w:pPr>
+            <w:r>
+              <w:rPr>
+                <w:rFonts w:ascii="Times New Roman" w:hAnsi="Times New Roman" w:cs="Times New Roman"/>
+                <w:sz w:val="24"/>
+                <w:szCs w:val="24"/>
               </w:rPr>
               <w:t>Request a password reset via time-limited token sent to email</w:t>
             </w:r>
@@ -1610,15 +1574,13 @@
                 <w:rFonts w:ascii="Times New Roman" w:hAnsi="Times New Roman" w:cs="Times New Roman"/>
                 <w:sz w:val="24"/>
                 <w:szCs w:val="24"/>
-                <w:lang/>
-              </w:rPr>
-            </w:pPr>
-            <w:r>
-              <w:rPr>
-                <w:rFonts w:ascii="Times New Roman" w:hAnsi="Times New Roman" w:cs="Times New Roman"/>
-                <w:sz w:val="24"/>
-                <w:szCs w:val="24"/>
-                <w:lang/>
+              </w:rPr>
+            </w:pPr>
+            <w:r>
+              <w:rPr>
+                <w:rFonts w:ascii="Times New Roman" w:hAnsi="Times New Roman" w:cs="Times New Roman"/>
+                <w:sz w:val="24"/>
+                <w:szCs w:val="24"/>
               </w:rPr>
               <w:t>Log study sessions (subject, hours studied, productivity score, date, notes)</w:t>
             </w:r>
@@ -1634,15 +1596,13 @@
                 <w:rFonts w:ascii="Times New Roman" w:hAnsi="Times New Roman" w:cs="Times New Roman"/>
                 <w:sz w:val="24"/>
                 <w:szCs w:val="24"/>
-                <w:lang/>
-              </w:rPr>
-            </w:pPr>
-            <w:r>
-              <w:rPr>
-                <w:rFonts w:ascii="Times New Roman" w:hAnsi="Times New Roman" w:cs="Times New Roman"/>
-                <w:sz w:val="24"/>
-                <w:szCs w:val="24"/>
-                <w:lang/>
+              </w:rPr>
+            </w:pPr>
+            <w:r>
+              <w:rPr>
+                <w:rFonts w:ascii="Times New Roman" w:hAnsi="Times New Roman" w:cs="Times New Roman"/>
+                <w:sz w:val="24"/>
+                <w:szCs w:val="24"/>
               </w:rPr>
               <w:t>Set and track weekly/monthly study goals per subject</w:t>
             </w:r>
@@ -1658,15 +1618,13 @@
                 <w:rFonts w:ascii="Times New Roman" w:hAnsi="Times New Roman" w:cs="Times New Roman"/>
                 <w:sz w:val="24"/>
                 <w:szCs w:val="24"/>
-                <w:lang/>
-              </w:rPr>
-            </w:pPr>
-            <w:r>
-              <w:rPr>
-                <w:rFonts w:ascii="Times New Roman" w:hAnsi="Times New Roman" w:cs="Times New Roman"/>
-                <w:sz w:val="24"/>
-                <w:szCs w:val="24"/>
-                <w:lang/>
+              </w:rPr>
+            </w:pPr>
+            <w:r>
+              <w:rPr>
+                <w:rFonts w:ascii="Times New Roman" w:hAnsi="Times New Roman" w:cs="Times New Roman"/>
+                <w:sz w:val="24"/>
+                <w:szCs w:val="24"/>
               </w:rPr>
               <w:t>View personal analytics dashboard (total hours, average scores, subject breakdown)</w:t>
             </w:r>
@@ -1682,15 +1640,13 @@
                 <w:rFonts w:ascii="Times New Roman" w:hAnsi="Times New Roman" w:cs="Times New Roman"/>
                 <w:sz w:val="24"/>
                 <w:szCs w:val="24"/>
-                <w:lang/>
-              </w:rPr>
-            </w:pPr>
-            <w:r>
-              <w:rPr>
-                <w:rFonts w:ascii="Times New Roman" w:hAnsi="Times New Roman" w:cs="Times New Roman"/>
-                <w:sz w:val="24"/>
-                <w:szCs w:val="24"/>
-                <w:lang/>
+              </w:rPr>
+            </w:pPr>
+            <w:r>
+              <w:rPr>
+                <w:rFonts w:ascii="Times New Roman" w:hAnsi="Times New Roman" w:cs="Times New Roman"/>
+                <w:sz w:val="24"/>
+                <w:szCs w:val="24"/>
               </w:rPr>
               <w:t>Receive notifications about weak areas and admin recommendations</w:t>
             </w:r>
@@ -1706,15 +1662,13 @@
                 <w:rFonts w:ascii="Times New Roman" w:hAnsi="Times New Roman" w:cs="Times New Roman"/>
                 <w:sz w:val="24"/>
                 <w:szCs w:val="24"/>
-                <w:lang/>
-              </w:rPr>
-            </w:pPr>
-            <w:r>
-              <w:rPr>
-                <w:rFonts w:ascii="Times New Roman" w:hAnsi="Times New Roman" w:cs="Times New Roman"/>
-                <w:sz w:val="24"/>
-                <w:szCs w:val="24"/>
-                <w:lang/>
+              </w:rPr>
+            </w:pPr>
+            <w:r>
+              <w:rPr>
+                <w:rFonts w:ascii="Times New Roman" w:hAnsi="Times New Roman" w:cs="Times New Roman"/>
+                <w:sz w:val="24"/>
+                <w:szCs w:val="24"/>
               </w:rPr>
               <w:t>View weekly performance report generated from vw_WeeklyReport</w:t>
             </w:r>
@@ -1727,18 +1681,16 @@
                 <w:rFonts w:ascii="Times New Roman" w:hAnsi="Times New Roman" w:cs="Times New Roman"/>
                 <w:sz w:val="24"/>
                 <w:szCs w:val="24"/>
-                <w:lang/>
-              </w:rPr>
-            </w:pPr>
-          </w:p>
-          <w:p>
-            <w:pPr>
-              <w:spacing w:after="0"/>
-              <w:rPr>
-                <w:rFonts w:ascii="Times New Roman" w:hAnsi="Times New Roman" w:cs="Times New Roman"/>
-                <w:sz w:val="24"/>
-                <w:szCs w:val="24"/>
-                <w:lang/>
+              </w:rPr>
+            </w:pPr>
+          </w:p>
+          <w:p>
+            <w:pPr>
+              <w:spacing w:after="0"/>
+              <w:rPr>
+                <w:rFonts w:ascii="Times New Roman" w:hAnsi="Times New Roman" w:cs="Times New Roman"/>
+                <w:sz w:val="24"/>
+                <w:szCs w:val="24"/>
               </w:rPr>
             </w:pPr>
             <w:r>
@@ -1748,7 +1700,6 @@
                 <w:bCs/>
                 <w:sz w:val="24"/>
                 <w:szCs w:val="24"/>
-                <w:lang/>
               </w:rPr>
               <w:t>Admin-Facing:</w:t>
             </w:r>
@@ -1764,15 +1715,13 @@
                 <w:rFonts w:ascii="Times New Roman" w:hAnsi="Times New Roman" w:cs="Times New Roman"/>
                 <w:sz w:val="24"/>
                 <w:szCs w:val="24"/>
-                <w:lang/>
-              </w:rPr>
-            </w:pPr>
-            <w:r>
-              <w:rPr>
-                <w:rFonts w:ascii="Times New Roman" w:hAnsi="Times New Roman" w:cs="Times New Roman"/>
-                <w:sz w:val="24"/>
-                <w:szCs w:val="24"/>
-                <w:lang/>
+              </w:rPr>
+            </w:pPr>
+            <w:r>
+              <w:rPr>
+                <w:rFonts w:ascii="Times New Roman" w:hAnsi="Times New Roman" w:cs="Times New Roman"/>
+                <w:sz w:val="24"/>
+                <w:szCs w:val="24"/>
               </w:rPr>
               <w:t>Log in with secured admin credentials</w:t>
             </w:r>
@@ -1788,15 +1737,13 @@
                 <w:rFonts w:ascii="Times New Roman" w:hAnsi="Times New Roman" w:cs="Times New Roman"/>
                 <w:sz w:val="24"/>
                 <w:szCs w:val="24"/>
-                <w:lang/>
-              </w:rPr>
-            </w:pPr>
-            <w:r>
-              <w:rPr>
-                <w:rFonts w:ascii="Times New Roman" w:hAnsi="Times New Roman" w:cs="Times New Roman"/>
-                <w:sz w:val="24"/>
-                <w:szCs w:val="24"/>
-                <w:lang/>
+              </w:rPr>
+            </w:pPr>
+            <w:r>
+              <w:rPr>
+                <w:rFonts w:ascii="Times New Roman" w:hAnsi="Times New Roman" w:cs="Times New Roman"/>
+                <w:sz w:val="24"/>
+                <w:szCs w:val="24"/>
               </w:rPr>
               <w:t>Add and manage subjects (name, category, target hours)</w:t>
             </w:r>
@@ -1812,15 +1759,13 @@
                 <w:rFonts w:ascii="Times New Roman" w:hAnsi="Times New Roman" w:cs="Times New Roman"/>
                 <w:sz w:val="24"/>
                 <w:szCs w:val="24"/>
-                <w:lang/>
-              </w:rPr>
-            </w:pPr>
-            <w:r>
-              <w:rPr>
-                <w:rFonts w:ascii="Times New Roman" w:hAnsi="Times New Roman" w:cs="Times New Roman"/>
-                <w:sz w:val="24"/>
-                <w:szCs w:val="24"/>
-                <w:lang/>
+              </w:rPr>
+            </w:pPr>
+            <w:r>
+              <w:rPr>
+                <w:rFonts w:ascii="Times New Roman" w:hAnsi="Times New Roman" w:cs="Times New Roman"/>
+                <w:sz w:val="24"/>
+                <w:szCs w:val="24"/>
               </w:rPr>
               <w:t>Create recommendations linked to subjects and score thresholds</w:t>
             </w:r>
@@ -1836,15 +1781,13 @@
                 <w:rFonts w:ascii="Times New Roman" w:hAnsi="Times New Roman" w:cs="Times New Roman"/>
                 <w:sz w:val="24"/>
                 <w:szCs w:val="24"/>
-                <w:lang/>
-              </w:rPr>
-            </w:pPr>
-            <w:r>
-              <w:rPr>
-                <w:rFonts w:ascii="Times New Roman" w:hAnsi="Times New Roman" w:cs="Times New Roman"/>
-                <w:sz w:val="24"/>
-                <w:szCs w:val="24"/>
-                <w:lang/>
+              </w:rPr>
+            </w:pPr>
+            <w:r>
+              <w:rPr>
+                <w:rFonts w:ascii="Times New Roman" w:hAnsi="Times New Roman" w:cs="Times New Roman"/>
+                <w:sz w:val="24"/>
+                <w:szCs w:val="24"/>
               </w:rPr>
               <w:t>View system-wide student performance summaries</w:t>
             </w:r>
@@ -1860,15 +1803,13 @@
                 <w:rFonts w:ascii="Times New Roman" w:hAnsi="Times New Roman" w:cs="Times New Roman"/>
                 <w:sz w:val="24"/>
                 <w:szCs w:val="24"/>
-                <w:lang/>
-              </w:rPr>
-            </w:pPr>
-            <w:r>
-              <w:rPr>
-                <w:rFonts w:ascii="Times New Roman" w:hAnsi="Times New Roman" w:cs="Times New Roman"/>
-                <w:sz w:val="24"/>
-                <w:szCs w:val="24"/>
-                <w:lang/>
+              </w:rPr>
+            </w:pPr>
+            <w:r>
+              <w:rPr>
+                <w:rFonts w:ascii="Times New Roman" w:hAnsi="Times New Roman" w:cs="Times New Roman"/>
+                <w:sz w:val="24"/>
+                <w:szCs w:val="24"/>
               </w:rPr>
               <w:t>Manage and export analytics reports in PDF or CSV format</w:t>
             </w:r>
@@ -1880,18 +1821,16 @@
                 <w:rFonts w:ascii="Times New Roman" w:hAnsi="Times New Roman" w:cs="Times New Roman"/>
                 <w:sz w:val="24"/>
                 <w:szCs w:val="24"/>
-                <w:lang/>
-              </w:rPr>
-            </w:pPr>
-          </w:p>
-          <w:p>
-            <w:pPr>
-              <w:spacing w:after="0"/>
-              <w:rPr>
-                <w:rFonts w:ascii="Times New Roman" w:hAnsi="Times New Roman" w:cs="Times New Roman"/>
-                <w:sz w:val="24"/>
-                <w:szCs w:val="24"/>
-                <w:lang/>
+              </w:rPr>
+            </w:pPr>
+          </w:p>
+          <w:p>
+            <w:pPr>
+              <w:spacing w:after="0"/>
+              <w:rPr>
+                <w:rFonts w:ascii="Times New Roman" w:hAnsi="Times New Roman" w:cs="Times New Roman"/>
+                <w:sz w:val="24"/>
+                <w:szCs w:val="24"/>
               </w:rPr>
             </w:pPr>
             <w:r>
@@ -1901,7 +1840,6 @@
                 <w:bCs/>
                 <w:sz w:val="24"/>
                 <w:szCs w:val="24"/>
-                <w:lang/>
               </w:rPr>
               <w:t>Database/System-Level:</w:t>
             </w:r>
@@ -1917,15 +1855,13 @@
                 <w:rFonts w:ascii="Times New Roman" w:hAnsi="Times New Roman" w:cs="Times New Roman"/>
                 <w:sz w:val="24"/>
                 <w:szCs w:val="24"/>
-                <w:lang/>
-              </w:rPr>
-            </w:pPr>
-            <w:r>
-              <w:rPr>
-                <w:rFonts w:ascii="Times New Roman" w:hAnsi="Times New Roman" w:cs="Times New Roman"/>
-                <w:sz w:val="24"/>
-                <w:szCs w:val="24"/>
-                <w:lang/>
+              </w:rPr>
+            </w:pPr>
+            <w:r>
+              <w:rPr>
+                <w:rFonts w:ascii="Times New Roman" w:hAnsi="Times New Roman" w:cs="Times New Roman"/>
+                <w:sz w:val="24"/>
+                <w:szCs w:val="24"/>
               </w:rPr>
               <w:t>AFTER INSERT trigger on StudyLog — auto-inserts into WeakArea if average productivity score falls below 50</w:t>
             </w:r>
@@ -1941,15 +1877,13 @@
                 <w:rFonts w:ascii="Times New Roman" w:hAnsi="Times New Roman" w:cs="Times New Roman"/>
                 <w:sz w:val="24"/>
                 <w:szCs w:val="24"/>
-                <w:lang/>
-              </w:rPr>
-            </w:pPr>
-            <w:r>
-              <w:rPr>
-                <w:rFonts w:ascii="Times New Roman" w:hAnsi="Times New Roman" w:cs="Times New Roman"/>
-                <w:sz w:val="24"/>
-                <w:szCs w:val="24"/>
-                <w:lang/>
+              </w:rPr>
+            </w:pPr>
+            <w:r>
+              <w:rPr>
+                <w:rFonts w:ascii="Times New Roman" w:hAnsi="Times New Roman" w:cs="Times New Roman"/>
+                <w:sz w:val="24"/>
+                <w:szCs w:val="24"/>
               </w:rPr>
               <w:t>Stored procedure sp_GetWeakSubjects(@StudentID) — returns all subjects below the defined threshold</w:t>
             </w:r>
@@ -1965,15 +1899,13 @@
                 <w:rFonts w:ascii="Times New Roman" w:hAnsi="Times New Roman" w:cs="Times New Roman"/>
                 <w:sz w:val="24"/>
                 <w:szCs w:val="24"/>
-                <w:lang/>
-              </w:rPr>
-            </w:pPr>
-            <w:r>
-              <w:rPr>
-                <w:rFonts w:ascii="Times New Roman" w:hAnsi="Times New Roman" w:cs="Times New Roman"/>
-                <w:sz w:val="24"/>
-                <w:szCs w:val="24"/>
-                <w:lang/>
+              </w:rPr>
+            </w:pPr>
+            <w:r>
+              <w:rPr>
+                <w:rFonts w:ascii="Times New Roman" w:hAnsi="Times New Roman" w:cs="Times New Roman"/>
+                <w:sz w:val="24"/>
+                <w:szCs w:val="24"/>
               </w:rPr>
               <w:t>Stored procedure sp_ResetPassword() — handles the forgot-password update flow</w:t>
             </w:r>
@@ -1989,15 +1921,13 @@
                 <w:rFonts w:ascii="Times New Roman" w:hAnsi="Times New Roman" w:cs="Times New Roman"/>
                 <w:sz w:val="24"/>
                 <w:szCs w:val="24"/>
-                <w:lang/>
-              </w:rPr>
-            </w:pPr>
-            <w:r>
-              <w:rPr>
-                <w:rFonts w:ascii="Times New Roman" w:hAnsi="Times New Roman" w:cs="Times New Roman"/>
-                <w:sz w:val="24"/>
-                <w:szCs w:val="24"/>
-                <w:lang/>
+              </w:rPr>
+            </w:pPr>
+            <w:r>
+              <w:rPr>
+                <w:rFonts w:ascii="Times New Roman" w:hAnsi="Times New Roman" w:cs="Times New Roman"/>
+                <w:sz w:val="24"/>
+                <w:szCs w:val="24"/>
               </w:rPr>
               <w:lastRenderedPageBreak/>
               <w:t>Indexes on StudyLog.StudentID, StudyLog.SubjectID, and PasswordResetToken.Token for query performance</w:t>
@@ -2014,15 +1944,13 @@
                 <w:rFonts w:ascii="Times New Roman" w:hAnsi="Times New Roman" w:cs="Times New Roman"/>
                 <w:sz w:val="24"/>
                 <w:szCs w:val="24"/>
-                <w:lang/>
-              </w:rPr>
-            </w:pPr>
-            <w:r>
-              <w:rPr>
-                <w:rFonts w:ascii="Times New Roman" w:hAnsi="Times New Roman" w:cs="Times New Roman"/>
-                <w:sz w:val="24"/>
-                <w:szCs w:val="24"/>
-                <w:lang/>
+              </w:rPr>
+            </w:pPr>
+            <w:r>
+              <w:rPr>
+                <w:rFonts w:ascii="Times New Roman" w:hAnsi="Times New Roman" w:cs="Times New Roman"/>
+                <w:sz w:val="24"/>
+                <w:szCs w:val="24"/>
               </w:rPr>
               <w:t>vw_WeeklyReport view — pre-joined summary across StudyLog and Subject tables</w:t>
             </w:r>
@@ -2038,15 +1966,13 @@
                 <w:rFonts w:ascii="Times New Roman" w:hAnsi="Times New Roman" w:cs="Times New Roman"/>
                 <w:sz w:val="24"/>
                 <w:szCs w:val="24"/>
-                <w:lang/>
-              </w:rPr>
-            </w:pPr>
-            <w:r>
-              <w:rPr>
-                <w:rFonts w:ascii="Times New Roman" w:hAnsi="Times New Roman" w:cs="Times New Roman"/>
-                <w:sz w:val="24"/>
-                <w:szCs w:val="24"/>
-                <w:lang/>
+              </w:rPr>
+            </w:pPr>
+            <w:r>
+              <w:rPr>
+                <w:rFonts w:ascii="Times New Roman" w:hAnsi="Times New Roman" w:cs="Times New Roman"/>
+                <w:sz w:val="24"/>
+                <w:szCs w:val="24"/>
               </w:rPr>
               <w:t>ROLLUP aggregation on (StudentID, SubjectID, Month) for the analytics dashboard</w:t>
             </w:r>
@@ -2058,7 +1984,6 @@
                 <w:rFonts w:ascii="Times New Roman" w:hAnsi="Times New Roman" w:cs="Times New Roman"/>
                 <w:sz w:val="24"/>
                 <w:szCs w:val="24"/>
-                <w:lang/>
               </w:rPr>
             </w:pPr>
           </w:p>
@@ -2143,19 +2068,18 @@
               <w:tc>
                 <w:tcPr>
                   <w:tcW w:w="1483" w:type="dxa"/>
+                  <w:vAlign w:val="center"/>
                   <w:hideMark/>
                 </w:tcPr>
                 <w:p>
                   <w:pPr>
                     <w:spacing w:after="0" w:line="240" w:lineRule="auto"/>
-                    <w:jc w:val="center"/>
                     <w:rPr>
                       <w:rFonts w:ascii="Times New Roman" w:eastAsia="Times New Roman" w:hAnsi="Times New Roman" w:cs="Times New Roman"/>
                       <w:b/>
                       <w:bCs/>
                       <w:sz w:val="24"/>
                       <w:szCs w:val="24"/>
-                      <w:lang/>
                     </w:rPr>
                   </w:pPr>
                   <w:r>
@@ -2165,7 +2089,6 @@
                       <w:bCs/>
                       <w:sz w:val="24"/>
                       <w:szCs w:val="24"/>
-                      <w:lang/>
                     </w:rPr>
                     <w:t>Member</w:t>
                   </w:r>
@@ -2174,19 +2097,18 @@
               <w:tc>
                 <w:tcPr>
                   <w:tcW w:w="1470" w:type="dxa"/>
+                  <w:vAlign w:val="center"/>
                   <w:hideMark/>
                 </w:tcPr>
                 <w:p>
                   <w:pPr>
                     <w:spacing w:after="0" w:line="240" w:lineRule="auto"/>
-                    <w:jc w:val="center"/>
                     <w:rPr>
                       <w:rFonts w:ascii="Times New Roman" w:eastAsia="Times New Roman" w:hAnsi="Times New Roman" w:cs="Times New Roman"/>
                       <w:b/>
                       <w:bCs/>
                       <w:sz w:val="24"/>
                       <w:szCs w:val="24"/>
-                      <w:lang/>
                     </w:rPr>
                   </w:pPr>
                   <w:r>
@@ -2196,7 +2118,6 @@
                       <w:bCs/>
                       <w:sz w:val="24"/>
                       <w:szCs w:val="24"/>
-                      <w:lang/>
                     </w:rPr>
                     <w:t>Module</w:t>
                   </w:r>
@@ -2205,19 +2126,18 @@
               <w:tc>
                 <w:tcPr>
                   <w:tcW w:w="0" w:type="auto"/>
+                  <w:vAlign w:val="center"/>
                   <w:hideMark/>
                 </w:tcPr>
                 <w:p>
                   <w:pPr>
                     <w:spacing w:after="0" w:line="240" w:lineRule="auto"/>
-                    <w:jc w:val="center"/>
                     <w:rPr>
                       <w:rFonts w:ascii="Times New Roman" w:eastAsia="Times New Roman" w:hAnsi="Times New Roman" w:cs="Times New Roman"/>
                       <w:b/>
                       <w:bCs/>
                       <w:sz w:val="24"/>
                       <w:szCs w:val="24"/>
-                      <w:lang/>
                     </w:rPr>
                   </w:pPr>
                   <w:r>
@@ -2227,7 +2147,6 @@
                       <w:bCs/>
                       <w:sz w:val="24"/>
                       <w:szCs w:val="24"/>
-                      <w:lang/>
                     </w:rPr>
                     <w:t>DBMS Responsibilities</w:t>
                   </w:r>
@@ -2238,6 +2157,7 @@
               <w:tc>
                 <w:tcPr>
                   <w:tcW w:w="1483" w:type="dxa"/>
+                  <w:vAlign w:val="center"/>
                   <w:hideMark/>
                 </w:tcPr>
                 <w:p>
@@ -2249,7 +2169,6 @@
                       <w:bCs/>
                       <w:sz w:val="24"/>
                       <w:szCs w:val="24"/>
-                      <w:lang/>
                     </w:rPr>
                   </w:pPr>
                 </w:p>
@@ -2260,7 +2179,6 @@
                       <w:rFonts w:ascii="Times New Roman" w:eastAsia="Times New Roman" w:hAnsi="Times New Roman" w:cs="Times New Roman"/>
                       <w:sz w:val="24"/>
                       <w:szCs w:val="24"/>
-                      <w:lang/>
                     </w:rPr>
                   </w:pPr>
                   <w:r>
@@ -2270,7 +2188,6 @@
                       <w:bCs/>
                       <w:sz w:val="24"/>
                       <w:szCs w:val="24"/>
-                      <w:lang/>
                     </w:rPr>
                     <w:t>Ammad Ahmed</w:t>
                   </w:r>
@@ -2279,6 +2196,7 @@
               <w:tc>
                 <w:tcPr>
                   <w:tcW w:w="1470" w:type="dxa"/>
+                  <w:vAlign w:val="center"/>
                   <w:hideMark/>
                 </w:tcPr>
                 <w:p>
@@ -2288,7 +2206,6 @@
                       <w:rFonts w:ascii="Times New Roman" w:eastAsia="Times New Roman" w:hAnsi="Times New Roman" w:cs="Times New Roman"/>
                       <w:sz w:val="24"/>
                       <w:szCs w:val="24"/>
-                      <w:lang/>
                     </w:rPr>
                   </w:pPr>
                   <w:r>
@@ -2296,7 +2213,6 @@
                       <w:rFonts w:ascii="Times New Roman" w:eastAsia="Times New Roman" w:hAnsi="Times New Roman" w:cs="Times New Roman"/>
                       <w:sz w:val="24"/>
                       <w:szCs w:val="24"/>
-                      <w:lang/>
                     </w:rPr>
                     <w:t>Auth &amp; Security</w:t>
                   </w:r>
@@ -2305,6 +2221,7 @@
               <w:tc>
                 <w:tcPr>
                   <w:tcW w:w="0" w:type="auto"/>
+                  <w:vAlign w:val="center"/>
                   <w:hideMark/>
                 </w:tcPr>
                 <w:p>
@@ -2386,7 +2303,6 @@
                       <w:rFonts w:asciiTheme="majorBidi" w:eastAsia="Times New Roman" w:hAnsiTheme="majorBidi" w:cstheme="majorBidi"/>
                       <w:sz w:val="24"/>
                       <w:szCs w:val="24"/>
-                      <w:lang/>
                     </w:rPr>
                   </w:pPr>
                   <w:r>
@@ -2404,6 +2320,7 @@
               <w:tc>
                 <w:tcPr>
                   <w:tcW w:w="1483" w:type="dxa"/>
+                  <w:vAlign w:val="center"/>
                   <w:hideMark/>
                 </w:tcPr>
                 <w:p>
@@ -2413,7 +2330,6 @@
                       <w:rFonts w:ascii="Times New Roman" w:eastAsia="Times New Roman" w:hAnsi="Times New Roman" w:cs="Times New Roman"/>
                       <w:sz w:val="24"/>
                       <w:szCs w:val="24"/>
-                      <w:lang/>
                     </w:rPr>
                   </w:pPr>
                   <w:r>
@@ -2423,7 +2339,6 @@
                       <w:bCs/>
                       <w:sz w:val="24"/>
                       <w:szCs w:val="24"/>
-                      <w:lang/>
                     </w:rPr>
                     <w:t>Shafaq Abdul Samad</w:t>
                   </w:r>
@@ -2432,6 +2347,7 @@
               <w:tc>
                 <w:tcPr>
                   <w:tcW w:w="1470" w:type="dxa"/>
+                  <w:vAlign w:val="center"/>
                   <w:hideMark/>
                 </w:tcPr>
                 <w:p>
@@ -2441,7 +2357,6 @@
                       <w:rFonts w:ascii="Times New Roman" w:eastAsia="Times New Roman" w:hAnsi="Times New Roman" w:cs="Times New Roman"/>
                       <w:sz w:val="24"/>
                       <w:szCs w:val="24"/>
-                      <w:lang/>
                     </w:rPr>
                   </w:pPr>
                   <w:r>
@@ -2449,7 +2364,6 @@
                       <w:rFonts w:ascii="Times New Roman" w:eastAsia="Times New Roman" w:hAnsi="Times New Roman" w:cs="Times New Roman"/>
                       <w:sz w:val="24"/>
                       <w:szCs w:val="24"/>
-                      <w:lang/>
                     </w:rPr>
                     <w:t>Study Logging</w:t>
                   </w:r>
@@ -2458,6 +2372,7 @@
               <w:tc>
                 <w:tcPr>
                   <w:tcW w:w="0" w:type="auto"/>
+                  <w:vAlign w:val="center"/>
                   <w:hideMark/>
                 </w:tcPr>
                 <w:p>
@@ -2521,7 +2436,6 @@
                       <w:rFonts w:asciiTheme="majorBidi" w:eastAsia="Times New Roman" w:hAnsiTheme="majorBidi" w:cstheme="majorBidi"/>
                       <w:sz w:val="24"/>
                       <w:szCs w:val="24"/>
-                      <w:lang/>
                     </w:rPr>
                   </w:pPr>
                   <w:r>
@@ -2539,6 +2453,7 @@
               <w:tc>
                 <w:tcPr>
                   <w:tcW w:w="1483" w:type="dxa"/>
+                  <w:vAlign w:val="center"/>
                   <w:hideMark/>
                 </w:tcPr>
                 <w:p>
@@ -2550,7 +2465,6 @@
                       <w:bCs/>
                       <w:sz w:val="24"/>
                       <w:szCs w:val="24"/>
-                      <w:lang/>
                     </w:rPr>
                   </w:pPr>
                 </w:p>
@@ -2561,7 +2475,6 @@
                       <w:rFonts w:ascii="Times New Roman" w:eastAsia="Times New Roman" w:hAnsi="Times New Roman" w:cs="Times New Roman"/>
                       <w:sz w:val="24"/>
                       <w:szCs w:val="24"/>
-                      <w:lang/>
                     </w:rPr>
                   </w:pPr>
                   <w:r>
@@ -2571,7 +2484,6 @@
                       <w:bCs/>
                       <w:sz w:val="24"/>
                       <w:szCs w:val="24"/>
-                      <w:lang/>
                     </w:rPr>
                     <w:t>Muhammad Farhan</w:t>
                   </w:r>
@@ -2580,6 +2492,7 @@
               <w:tc>
                 <w:tcPr>
                   <w:tcW w:w="1470" w:type="dxa"/>
+                  <w:vAlign w:val="center"/>
                   <w:hideMark/>
                 </w:tcPr>
                 <w:p>
@@ -2589,7 +2502,6 @@
                       <w:rFonts w:ascii="Times New Roman" w:eastAsia="Times New Roman" w:hAnsi="Times New Roman" w:cs="Times New Roman"/>
                       <w:sz w:val="24"/>
                       <w:szCs w:val="24"/>
-                      <w:lang/>
                     </w:rPr>
                   </w:pPr>
                   <w:r>
@@ -2597,7 +2509,6 @@
                       <w:rFonts w:ascii="Times New Roman" w:eastAsia="Times New Roman" w:hAnsi="Times New Roman" w:cs="Times New Roman"/>
                       <w:sz w:val="24"/>
                       <w:szCs w:val="24"/>
-                      <w:lang/>
                     </w:rPr>
                     <w:t>Analytics &amp; Reports</w:t>
                   </w:r>
@@ -2606,6 +2517,7 @@
               <w:tc>
                 <w:tcPr>
                   <w:tcW w:w="0" w:type="auto"/>
+                  <w:vAlign w:val="center"/>
                   <w:hideMark/>
                 </w:tcPr>
                 <w:p>
@@ -2687,7 +2599,6 @@
                       <w:rFonts w:asciiTheme="majorBidi" w:eastAsia="Times New Roman" w:hAnsiTheme="majorBidi" w:cstheme="majorBidi"/>
                       <w:sz w:val="24"/>
                       <w:szCs w:val="24"/>
-                      <w:lang/>
                     </w:rPr>
                   </w:pPr>
                   <w:r>
@@ -2705,6 +2616,7 @@
               <w:tc>
                 <w:tcPr>
                   <w:tcW w:w="1483" w:type="dxa"/>
+                  <w:vAlign w:val="center"/>
                   <w:hideMark/>
                 </w:tcPr>
                 <w:p>
@@ -2714,7 +2626,6 @@
                       <w:rFonts w:ascii="Times New Roman" w:eastAsia="Times New Roman" w:hAnsi="Times New Roman" w:cs="Times New Roman"/>
                       <w:sz w:val="24"/>
                       <w:szCs w:val="24"/>
-                      <w:lang/>
                     </w:rPr>
                   </w:pPr>
                   <w:r>
@@ -2724,7 +2635,6 @@
                       <w:bCs/>
                       <w:sz w:val="24"/>
                       <w:szCs w:val="24"/>
-                      <w:lang/>
                     </w:rPr>
                     <w:t>Arbaz Khan Orakzai</w:t>
                   </w:r>
@@ -2733,6 +2643,7 @@
               <w:tc>
                 <w:tcPr>
                   <w:tcW w:w="1470" w:type="dxa"/>
+                  <w:vAlign w:val="center"/>
                   <w:hideMark/>
                 </w:tcPr>
                 <w:p>
@@ -2742,7 +2653,6 @@
                       <w:rFonts w:ascii="Times New Roman" w:eastAsia="Times New Roman" w:hAnsi="Times New Roman" w:cs="Times New Roman"/>
                       <w:sz w:val="24"/>
                       <w:szCs w:val="24"/>
-                      <w:lang/>
                     </w:rPr>
                   </w:pPr>
                   <w:r>
@@ -2750,7 +2660,6 @@
                       <w:rFonts w:ascii="Times New Roman" w:eastAsia="Times New Roman" w:hAnsi="Times New Roman" w:cs="Times New Roman"/>
                       <w:sz w:val="24"/>
                       <w:szCs w:val="24"/>
-                      <w:lang/>
                     </w:rPr>
                     <w:t>Intelligence &amp; Notifications</w:t>
                   </w:r>
@@ -2759,6 +2668,7 @@
               <w:tc>
                 <w:tcPr>
                   <w:tcW w:w="0" w:type="auto"/>
+                  <w:vAlign w:val="center"/>
                   <w:hideMark/>
                 </w:tcPr>
                 <w:p>
@@ -2840,7 +2750,6 @@
                       <w:rFonts w:asciiTheme="majorBidi" w:eastAsia="Times New Roman" w:hAnsiTheme="majorBidi" w:cstheme="majorBidi"/>
                       <w:sz w:val="24"/>
                       <w:szCs w:val="24"/>
-                      <w:lang/>
                     </w:rPr>
                   </w:pPr>
                   <w:r>
@@ -2862,7 +2771,6 @@
                 <w:rFonts w:ascii="Times New Roman" w:hAnsi="Times New Roman" w:cs="Times New Roman"/>
                 <w:sz w:val="24"/>
                 <w:szCs w:val="24"/>
-                <w:lang/>
               </w:rPr>
             </w:pPr>
           </w:p>
@@ -2873,7 +2781,6 @@
                 <w:rFonts w:ascii="Times New Roman" w:hAnsi="Times New Roman" w:cs="Times New Roman"/>
                 <w:sz w:val="2"/>
                 <w:szCs w:val="2"/>
-                <w:lang/>
               </w:rPr>
             </w:pPr>
           </w:p>
@@ -4523,4 +4430,26 @@
     </a:ext>
   </a:extLst>
 </a:theme>
+</file>
+
+<file path=word/webextensions/taskpanes.xml><?xml version="1.0" encoding="utf-8"?>
+<wetp:taskpanes xmlns:wetp="http://schemas.microsoft.com/office/webextensions/taskpanes/2010/11">
+  <wetp:taskpane dockstate="right" visibility="0" width="438" row="1">
+    <wetp:webextensionref xmlns:r="http://schemas.openxmlformats.org/officeDocument/2006/relationships" r:id="rId1"/>
+  </wetp:taskpane>
+</wetp:taskpanes>
+</file>
+
+<file path=word/webextensions/webextension1.xml><?xml version="1.0" encoding="utf-8"?>
+<we:webextension xmlns:we="http://schemas.microsoft.com/office/webextensions/webextension/2010/11" id="{1514F206-B61C-4DFF-98A1-D92E14224896}">
+  <we:reference id="wa200010453" version="1.0.0.1" store="en-US" storeType="OMEX"/>
+  <we:alternateReferences>
+    <we:reference id="WA200010453" version="1.0.0.1" store="WA200010453" storeType="OMEX"/>
+  </we:alternateReferences>
+  <we:properties>
+    <we:property name="claude.fileId" value="&quot;c5f00ff5-ca7e-4948-872f-ccd706fb40b9&quot;"/>
+  </we:properties>
+  <we:bindings/>
+  <we:snapshot xmlns:r="http://schemas.openxmlformats.org/officeDocument/2006/relationships"/>
+</we:webextension>
 </file>
</xml_diff>